<commit_message>
fix(examples): keep confirmation table inside the printable page
</commit_message>
<xml_diff>
--- a/src/docflow/examples/02_confirmation.docx
+++ b/src/docflow/examples/02_confirmation.docx
@@ -46,7 +46,7 @@
       <w:tr>
         <w:tc>
           <w:tcPr>
-            <w:tcW w:type="dxa" w:w="4824"/>
+            <w:tcW w:type="dxa" w:w="3024"/>
             <w:vAlign w:val="center"/>
             <w:tcBorders>
               <w:top w:val="single" w:sz="4" w:color="D9D9D9"/>
@@ -77,7 +77,7 @@
         </w:tc>
         <w:tc>
           <w:tcPr>
-            <w:tcW w:type="dxa" w:w="4824"/>
+            <w:tcW w:type="dxa" w:w="6336"/>
             <w:vAlign w:val="center"/>
             <w:tcBorders>
               <w:top w:val="single" w:sz="4" w:color="D9D9D9"/>

</xml_diff>